<commit_message>
Retail CV: add TK Maxx, Westside, True Street Food and Bardez roles
Co-Authored-By: Claude Opus 5.5 <noreply@anthropic.com>
Claude-Session: https://claude.ai/code/session_01MNmMoUTURwQqNjm7K6SsYQ
</commit_message>
<xml_diff>
--- a/cv/Jithin_George_Retail_CV.docx
+++ b/cv/Jithin_George_Retail_CV.docx
@@ -49,7 +49,7 @@
     </w:p>
     <w:p>
       <w:pPr>
-        <w:spacing w:after="80" w:before="180"/>
+        <w:spacing w:after="60" w:before="160"/>
         <w:pBdr>
           <w:bottom w:val="single" w:sz="6" w:space="2" w:color="333333"/>
         </w:pBdr>
@@ -70,12 +70,12 @@
         <w:rPr>
           <w:b w:val="0"/>
         </w:rPr>
-        <w:t>Friendly, dependable retail and customer service professional with UK experience on the front of house and in a busy warehouse, backed by three years in client-facing marketing roles. Comfortable on the shop floor, at the till and in the stockroom, with a good eye for product presentation and a habit of keeping track of the numbers that matter – sales, stock and customer feedback. MSc Digital Marketing graduate (dissertation on consumer behaviour) who understands what makes customers buy and come back.</w:t>
+        <w:t>Customer-focused retail and front of house professional with experience in fashion retail in India and the UK, including TK Maxx, alongside busy hospitality roles in the UK. Confident on the till, on the shop floor and in the stockroom, with a sharp eye for display standards. Backed by three years in client-facing marketing and an MSc in Digital Marketing focused on consumer behaviour.</w:t>
       </w:r>
     </w:p>
     <w:p>
       <w:pPr>
-        <w:spacing w:after="80" w:before="180"/>
+        <w:spacing w:after="60" w:before="160"/>
         <w:pBdr>
           <w:bottom w:val="single" w:sz="6" w:space="2" w:color="333333"/>
         </w:pBdr>
@@ -85,7 +85,7 @@
           <w:b/>
           <w:sz w:val="23"/>
         </w:rPr>
-        <w:t>RETAIL &amp; CUSTOMER SERVICE EXPERIENCE</w:t>
+        <w:t>RETAIL EXPERIENCE</w:t>
       </w:r>
     </w:p>
     <w:p>
@@ -93,32 +93,26 @@
         <w:tabs>
           <w:tab w:pos="9751" w:val="right"/>
         </w:tabs>
-        <w:spacing w:after="40" w:before="140"/>
+        <w:spacing w:after="20" w:before="100"/>
       </w:pPr>
       <w:r>
         <w:rPr>
           <w:b/>
         </w:rPr>
-        <w:t>Front of House Team Member (Part-time)</w:t>
+        <w:t>Sales Assistant</w:t>
       </w:r>
       <w:r>
         <w:rPr>
           <w:b w:val="0"/>
         </w:rPr>
-        <w:t xml:space="preserve"> – </w:t>
+        <w:t xml:space="preserve"> – TK Maxx, </w:t>
       </w:r>
       <w:r>
         <w:rPr>
           <w:b w:val="0"/>
           <w:highlight w:val="yellow"/>
         </w:rPr>
-        <w:t>Venue name</w:t>
-      </w:r>
-      <w:r>
-        <w:rPr>
-          <w:b w:val="0"/>
-        </w:rPr>
-        <w:t>, Manchester</w:t>
+        <w:t>City</w:t>
       </w:r>
       <w:r>
         <w:rPr>
@@ -131,7 +125,7 @@
           <w:b w:val="0"/>
           <w:highlight w:val="yellow"/>
         </w:rPr>
-        <w:t>Month 2024 – Month 2025</w:t>
+        <w:t>Month Year – Month Year</w:t>
       </w:r>
     </w:p>
     <w:p>
@@ -143,7 +137,7 @@
         <w:rPr>
           <w:b w:val="0"/>
         </w:rPr>
-        <w:t xml:space="preserve">Served </w:t>
+        <w:t xml:space="preserve">Processed </w:t>
       </w:r>
       <w:r>
         <w:rPr>
@@ -156,7 +150,7 @@
         <w:rPr>
           <w:b w:val="0"/>
         </w:rPr>
-        <w:t xml:space="preserve"> customers per shift at peak times, keeping queues moving while staying warm and welcoming.</w:t>
+        <w:t xml:space="preserve"> transactions per shift, including refunds, exchanges and gift cards, with fully balanced cash-ups.</w:t>
       </w:r>
     </w:p>
     <w:p>
@@ -168,20 +162,20 @@
         <w:rPr>
           <w:b w:val="0"/>
         </w:rPr>
-        <w:t xml:space="preserve">Took cash and card payments on the EPOS till with </w:t>
+        <w:t xml:space="preserve">Unpacked, tagged and priced </w:t>
       </w:r>
       <w:r>
         <w:rPr>
           <w:b w:val="0"/>
           <w:highlight w:val="yellow"/>
         </w:rPr>
-        <w:t>zero</w:t>
+        <w:t>20+</w:t>
       </w:r>
       <w:r>
         <w:rPr>
           <w:b w:val="0"/>
         </w:rPr>
-        <w:t xml:space="preserve"> discrepancies at end-of-shift cash-ups.</w:t>
+        <w:t xml:space="preserve"> cages of new stock a day, getting fresh lines onto the shop floor quickly.</w:t>
       </w:r>
     </w:p>
     <w:p>
@@ -193,7 +187,7 @@
         <w:rPr>
           <w:b w:val="0"/>
         </w:rPr>
-        <w:t>Suggested add-ons and current promotions to help increase average spend per customer.</w:t>
+        <w:t>Kept departments and fitting rooms sized, tidy and recovered to brand standard throughout trading hours.</w:t>
       </w:r>
     </w:p>
     <w:p>
@@ -205,19 +199,7 @@
         <w:rPr>
           <w:b w:val="0"/>
         </w:rPr>
-        <w:t>Dealt with complaints and queries calmly on the spot, passing to a manager only when needed.</w:t>
-      </w:r>
-    </w:p>
-    <w:p>
-      <w:pPr>
-        <w:pStyle w:val="ListBullet"/>
-        <w:spacing w:after="20"/>
-      </w:pPr>
-      <w:r>
-        <w:rPr>
-          <w:b w:val="0"/>
-        </w:rPr>
-        <w:t>Kept the customer area clean, well stocked and in line with health, safety and food hygiene rules.</w:t>
+        <w:t>Helped customers find sizes, brands and bargains, turning browsers into buyers with honest product advice.</w:t>
       </w:r>
     </w:p>
     <w:p>
@@ -225,32 +207,19 @@
         <w:tabs>
           <w:tab w:pos="9751" w:val="right"/>
         </w:tabs>
-        <w:spacing w:after="40" w:before="140"/>
+        <w:spacing w:after="20" w:before="100"/>
       </w:pPr>
       <w:r>
         <w:rPr>
           <w:b/>
         </w:rPr>
-        <w:t>Warehouse Operative (Part-time)</w:t>
+        <w:t>Sales Associate</w:t>
       </w:r>
       <w:r>
         <w:rPr>
           <w:b w:val="0"/>
         </w:rPr>
-        <w:t xml:space="preserve"> – </w:t>
-      </w:r>
-      <w:r>
-        <w:rPr>
-          <w:b w:val="0"/>
-          <w:highlight w:val="yellow"/>
-        </w:rPr>
-        <w:t>Company name</w:t>
-      </w:r>
-      <w:r>
-        <w:rPr>
-          <w:b w:val="0"/>
-        </w:rPr>
-        <w:t>, Manchester</w:t>
+        <w:t xml:space="preserve"> – Westside, Mumbai, India</w:t>
       </w:r>
       <w:r>
         <w:rPr>
@@ -263,7 +232,7 @@
           <w:b w:val="0"/>
           <w:highlight w:val="yellow"/>
         </w:rPr>
-        <w:t>Month 2024 – Month 2025</w:t>
+        <w:t>Month Year – Month Year</w:t>
       </w:r>
     </w:p>
     <w:p>
@@ -275,20 +244,20 @@
         <w:rPr>
           <w:b w:val="0"/>
         </w:rPr>
-        <w:t xml:space="preserve">Picked, packed and dispatched </w:t>
+        <w:t xml:space="preserve">Assisted </w:t>
       </w:r>
       <w:r>
         <w:rPr>
           <w:b w:val="0"/>
           <w:highlight w:val="yellow"/>
         </w:rPr>
-        <w:t>100+</w:t>
+        <w:t>60+</w:t>
       </w:r>
       <w:r>
         <w:rPr>
           <w:b w:val="0"/>
         </w:rPr>
-        <w:t xml:space="preserve"> orders per shift with a handheld scanner, meeting daily pick targets.</w:t>
+        <w:t xml:space="preserve"> customers a day on the fashion floor with styling, sizing and outfit suggestions.</w:t>
       </w:r>
     </w:p>
     <w:p>
@@ -300,7 +269,20 @@
         <w:rPr>
           <w:b w:val="0"/>
         </w:rPr>
-        <w:t>Checked incoming deliveries against delivery notes and reported damaged or missing items.</w:t>
+        <w:t xml:space="preserve">Signed up </w:t>
+      </w:r>
+      <w:r>
+        <w:rPr>
+          <w:b w:val="0"/>
+          <w:highlight w:val="yellow"/>
+        </w:rPr>
+        <w:t>40+</w:t>
+      </w:r>
+      <w:r>
+        <w:rPr>
+          <w:b w:val="0"/>
+        </w:rPr>
+        <w:t xml:space="preserve"> new ClubWest loyalty members each month by explaining the benefits at the till.</w:t>
       </w:r>
     </w:p>
     <w:p>
@@ -312,7 +294,7 @@
         <w:rPr>
           <w:b w:val="0"/>
         </w:rPr>
-        <w:t>Supported weekly stock counts and replenishment so products were accurate and easy to locate.</w:t>
+        <w:t>Set up new-season displays and mannequins in line with visual merchandising guidelines.</w:t>
       </w:r>
     </w:p>
     <w:p>
@@ -324,12 +306,205 @@
         <w:rPr>
           <w:b w:val="0"/>
         </w:rPr>
-        <w:t>Followed manual handling and health and safety procedures in a fast-paced environment.</w:t>
+        <w:t>Supported stock receiving, replenishment and monthly stock audits to keep counts accurate.</w:t>
       </w:r>
     </w:p>
     <w:p>
       <w:pPr>
-        <w:spacing w:after="80" w:before="180"/>
+        <w:spacing w:after="60" w:before="160"/>
+        <w:pBdr>
+          <w:bottom w:val="single" w:sz="6" w:space="2" w:color="333333"/>
+        </w:pBdr>
+      </w:pPr>
+      <w:r>
+        <w:rPr>
+          <w:b/>
+          <w:sz w:val="23"/>
+        </w:rPr>
+        <w:t>FRONT OF HOUSE EXPERIENCE</w:t>
+      </w:r>
+    </w:p>
+    <w:p>
+      <w:pPr>
+        <w:tabs>
+          <w:tab w:pos="9751" w:val="right"/>
+        </w:tabs>
+        <w:spacing w:after="20" w:before="100"/>
+      </w:pPr>
+      <w:r>
+        <w:rPr>
+          <w:b/>
+        </w:rPr>
+        <w:t>Front of House Team Member</w:t>
+      </w:r>
+      <w:r>
+        <w:rPr>
+          <w:b w:val="0"/>
+        </w:rPr>
+        <w:t xml:space="preserve"> – True Street Food, </w:t>
+      </w:r>
+      <w:r>
+        <w:rPr>
+          <w:b w:val="0"/>
+          <w:highlight w:val="yellow"/>
+        </w:rPr>
+        <w:t>City</w:t>
+      </w:r>
+      <w:r>
+        <w:rPr>
+          <w:b w:val="0"/>
+        </w:rPr>
+        <w:tab/>
+      </w:r>
+      <w:r>
+        <w:rPr>
+          <w:b w:val="0"/>
+          <w:highlight w:val="yellow"/>
+        </w:rPr>
+        <w:t>Month Year – Month Year</w:t>
+      </w:r>
+    </w:p>
+    <w:p>
+      <w:pPr>
+        <w:pStyle w:val="ListBullet"/>
+        <w:spacing w:after="20"/>
+      </w:pPr>
+      <w:r>
+        <w:rPr>
+          <w:b w:val="0"/>
+        </w:rPr>
+        <w:t xml:space="preserve">Took orders and payments for </w:t>
+      </w:r>
+      <w:r>
+        <w:rPr>
+          <w:b w:val="0"/>
+          <w:highlight w:val="yellow"/>
+        </w:rPr>
+        <w:t>120+</w:t>
+      </w:r>
+      <w:r>
+        <w:rPr>
+          <w:b w:val="0"/>
+        </w:rPr>
+        <w:t xml:space="preserve"> customers per shift on the EPOS system during lunch and evening rushes.</w:t>
+      </w:r>
+    </w:p>
+    <w:p>
+      <w:pPr>
+        <w:pStyle w:val="ListBullet"/>
+        <w:spacing w:after="20"/>
+      </w:pPr>
+      <w:r>
+        <w:rPr>
+          <w:b w:val="0"/>
+        </w:rPr>
+        <w:t>Explained the menu, specials and allergen information clearly so every customer ordered with confidence.</w:t>
+      </w:r>
+    </w:p>
+    <w:p>
+      <w:pPr>
+        <w:pStyle w:val="ListBullet"/>
+        <w:spacing w:after="20"/>
+      </w:pPr>
+      <w:r>
+        <w:rPr>
+          <w:b w:val="0"/>
+        </w:rPr>
+        <w:t>Kept the counter and seating area clean, stocked and compliant with food hygiene standards.</w:t>
+      </w:r>
+    </w:p>
+    <w:p>
+      <w:pPr>
+        <w:tabs>
+          <w:tab w:pos="9751" w:val="right"/>
+        </w:tabs>
+        <w:spacing w:after="20" w:before="100"/>
+      </w:pPr>
+      <w:r>
+        <w:rPr>
+          <w:b/>
+        </w:rPr>
+        <w:t>Front of House Staff</w:t>
+      </w:r>
+      <w:r>
+        <w:rPr>
+          <w:b w:val="0"/>
+        </w:rPr>
+        <w:t xml:space="preserve"> – Bardez, </w:t>
+      </w:r>
+      <w:r>
+        <w:rPr>
+          <w:b w:val="0"/>
+          <w:highlight w:val="yellow"/>
+        </w:rPr>
+        <w:t>City</w:t>
+      </w:r>
+      <w:r>
+        <w:rPr>
+          <w:b w:val="0"/>
+        </w:rPr>
+        <w:tab/>
+      </w:r>
+      <w:r>
+        <w:rPr>
+          <w:b w:val="0"/>
+          <w:highlight w:val="yellow"/>
+        </w:rPr>
+        <w:t>Month Year – Month Year</w:t>
+      </w:r>
+    </w:p>
+    <w:p>
+      <w:pPr>
+        <w:pStyle w:val="ListBullet"/>
+        <w:spacing w:after="20"/>
+      </w:pPr>
+      <w:r>
+        <w:rPr>
+          <w:b w:val="0"/>
+        </w:rPr>
+        <w:t>Welcomed guests, managed walk-ins and reservations, and kept table turnover smooth on busy nights.</w:t>
+      </w:r>
+    </w:p>
+    <w:p>
+      <w:pPr>
+        <w:pStyle w:val="ListBullet"/>
+        <w:spacing w:after="20"/>
+      </w:pPr>
+      <w:r>
+        <w:rPr>
+          <w:b w:val="0"/>
+        </w:rPr>
+        <w:t xml:space="preserve">Looked after </w:t>
+      </w:r>
+      <w:r>
+        <w:rPr>
+          <w:b w:val="0"/>
+          <w:highlight w:val="yellow"/>
+        </w:rPr>
+        <w:t>6–8</w:t>
+      </w:r>
+      <w:r>
+        <w:rPr>
+          <w:b w:val="0"/>
+        </w:rPr>
+        <w:t xml:space="preserve"> tables per shift, recommending drinks and desserts to increase spend per table.</w:t>
+      </w:r>
+    </w:p>
+    <w:p>
+      <w:pPr>
+        <w:pStyle w:val="ListBullet"/>
+        <w:spacing w:after="20"/>
+      </w:pPr>
+      <w:r>
+        <w:rPr>
+          <w:b w:val="0"/>
+        </w:rPr>
+        <w:t>Handled card and cash payments, including split bills, accurately and quickly.</w:t>
+      </w:r>
+    </w:p>
+    <w:p>
+      <w:pPr>
+        <w:spacing w:after="60" w:before="160"/>
         <w:pBdr>
           <w:bottom w:val="single" w:sz="6" w:space="2" w:color="333333"/>
         </w:pBdr>
@@ -347,7 +522,7 @@
         <w:tabs>
           <w:tab w:pos="9751" w:val="right"/>
         </w:tabs>
-        <w:spacing w:after="40" w:before="140"/>
+        <w:spacing w:after="20" w:before="100"/>
       </w:pPr>
       <w:r>
         <w:rPr>
@@ -378,7 +553,7 @@
         <w:rPr>
           <w:b w:val="0"/>
         </w:rPr>
-        <w:t>Look after 8–12 client accounts each campaign cycle, meeting 100% of delivery targets through planning and regular follow-ups.</w:t>
+        <w:t>Look after 8–12 client accounts each campaign cycle, meeting 100% of delivery targets.</w:t>
       </w:r>
     </w:p>
     <w:p>
@@ -395,34 +570,10 @@
     </w:p>
     <w:p>
       <w:pPr>
-        <w:pStyle w:val="ListBullet"/>
-        <w:spacing w:after="20"/>
-      </w:pPr>
-      <w:r>
-        <w:rPr>
-          <w:b w:val="0"/>
-        </w:rPr>
-        <w:t>Ran 4 campaigns from first brief to final delivery, keeping clients informed at every stage.</w:t>
-      </w:r>
-    </w:p>
-    <w:p>
-      <w:pPr>
-        <w:pStyle w:val="ListBullet"/>
-        <w:spacing w:after="20"/>
-      </w:pPr>
-      <w:r>
-        <w:rPr>
-          <w:b w:val="0"/>
-        </w:rPr>
-        <w:t>Track KPIs in Excel and Trello and create client presentations in Canva.</w:t>
-      </w:r>
-    </w:p>
-    <w:p>
-      <w:pPr>
         <w:tabs>
           <w:tab w:pos="9751" w:val="right"/>
         </w:tabs>
-        <w:spacing w:after="40" w:before="140"/>
+        <w:spacing w:after="20" w:before="100"/>
       </w:pPr>
       <w:r>
         <w:rPr>
@@ -453,31 +604,7 @@
         <w:rPr>
           <w:b w:val="0"/>
         </w:rPr>
-        <w:t>Onboarded 10+ creators per campaign, managing contracts, timelines and deliverables.</w:t>
-      </w:r>
-    </w:p>
-    <w:p>
-      <w:pPr>
-        <w:pStyle w:val="ListBullet"/>
-        <w:spacing w:after="20"/>
-      </w:pPr>
-      <w:r>
-        <w:rPr>
-          <w:b w:val="0"/>
-        </w:rPr>
-        <w:t>Built and maintained a database of 500+ creators, making it quicker to match brands with the right people.</w:t>
-      </w:r>
-    </w:p>
-    <w:p>
-      <w:pPr>
-        <w:pStyle w:val="ListBullet"/>
-        <w:spacing w:after="20"/>
-      </w:pPr>
-      <w:r>
-        <w:rPr>
-          <w:b w:val="0"/>
-        </w:rPr>
-        <w:t>Reviewed results across 60+ posts (reach, impressions, engagement) to choose top performers for repeat work.</w:t>
+        <w:t>Onboarded 10+ creators per campaign and built a database of 500+ creators for faster brand matching.</w:t>
       </w:r>
     </w:p>
     <w:p>
@@ -485,7 +612,7 @@
         <w:tabs>
           <w:tab w:pos="9751" w:val="right"/>
         </w:tabs>
-        <w:spacing w:after="40" w:before="140"/>
+        <w:spacing w:after="20" w:before="100"/>
       </w:pPr>
       <w:r>
         <w:rPr>
@@ -516,36 +643,12 @@
         <w:rPr>
           <w:b w:val="0"/>
         </w:rPr>
-        <w:t>Sourced 300+ applicants through social media and ran online auditions for 250+ participants.</w:t>
+        <w:t>Ran online auditions for 250+ participants and set up an Excel tracker that cut turnaround time by 40%.</w:t>
       </w:r>
     </w:p>
     <w:p>
       <w:pPr>
-        <w:pStyle w:val="ListBullet"/>
-        <w:spacing w:after="20"/>
-      </w:pPr>
-      <w:r>
-        <w:rPr>
-          <w:b w:val="0"/>
-        </w:rPr>
-        <w:t>Worked with a 4–6 person production team to organise audition schedules and availability.</w:t>
-      </w:r>
-    </w:p>
-    <w:p>
-      <w:pPr>
-        <w:pStyle w:val="ListBullet"/>
-        <w:spacing w:after="20"/>
-      </w:pPr>
-      <w:r>
-        <w:rPr>
-          <w:b w:val="0"/>
-        </w:rPr>
-        <w:t>Set up a shared Excel tracker that cut turnaround time by 40%.</w:t>
-      </w:r>
-    </w:p>
-    <w:p>
-      <w:pPr>
-        <w:spacing w:after="80" w:before="180"/>
+        <w:spacing w:after="60" w:before="160"/>
         <w:pBdr>
           <w:bottom w:val="single" w:sz="6" w:space="2" w:color="333333"/>
         </w:pBdr>
@@ -605,7 +708,7 @@
     </w:p>
     <w:p>
       <w:pPr>
-        <w:spacing w:after="80" w:before="180"/>
+        <w:spacing w:after="60" w:before="160"/>
         <w:pBdr>
           <w:bottom w:val="single" w:sz="6" w:space="2" w:color="333333"/>
         </w:pBdr>
@@ -694,7 +797,7 @@
               <w:rPr>
                 <w:b w:val="0"/>
               </w:rPr>
-              <w:t>Handheld scanners and stock counts</w:t>
+              <w:t>Security tagging and loss prevention</w:t>
             </w:r>
           </w:p>
         </w:tc>
@@ -774,7 +877,7 @@
     </w:tbl>
     <w:p>
       <w:pPr>
-        <w:spacing w:after="0" w:before="160"/>
+        <w:spacing w:after="0" w:before="100"/>
       </w:pPr>
       <w:r>
         <w:rPr>

</xml_diff>

<commit_message>
Retail CV: add dates, Chit and Chat, TK Maxx Wembley; keep to one page
Co-Authored-By: Claude Opus 5.5 <noreply@anthropic.com>
Claude-Session: https://claude.ai/code/session_01MNmMoUTURwQqNjm7K6SsYQ
</commit_message>
<xml_diff>
--- a/cv/Jithin_George_Retail_CV.docx
+++ b/cv/Jithin_George_Retail_CV.docx
@@ -91,7 +91,7 @@
     <w:p>
       <w:pPr>
         <w:tabs>
-          <w:tab w:pos="9751" w:val="right"/>
+          <w:tab w:pos="10091" w:val="right"/>
         </w:tabs>
         <w:spacing w:after="20" w:before="100"/>
       </w:pPr>
@@ -105,27 +105,14 @@
         <w:rPr>
           <w:b w:val="0"/>
         </w:rPr>
-        <w:t xml:space="preserve"> – TK Maxx, </w:t>
-      </w:r>
-      <w:r>
-        <w:rPr>
-          <w:b w:val="0"/>
-          <w:highlight w:val="yellow"/>
-        </w:rPr>
-        <w:t>City</w:t>
+        <w:t xml:space="preserve"> – TK Maxx, Wembley, London</w:t>
       </w:r>
       <w:r>
         <w:rPr>
           <w:b w:val="0"/>
         </w:rPr>
         <w:tab/>
-      </w:r>
-      <w:r>
-        <w:rPr>
-          <w:b w:val="0"/>
-          <w:highlight w:val="yellow"/>
-        </w:rPr>
-        <w:t>Month Year – Month Year</w:t>
+        <w:t>Jan 2026 – Sep 2026</w:t>
       </w:r>
     </w:p>
     <w:p>
@@ -137,20 +124,7 @@
         <w:rPr>
           <w:b w:val="0"/>
         </w:rPr>
-        <w:t xml:space="preserve">Processed </w:t>
-      </w:r>
-      <w:r>
-        <w:rPr>
-          <w:b w:val="0"/>
-          <w:highlight w:val="yellow"/>
-        </w:rPr>
-        <w:t>150+</w:t>
-      </w:r>
-      <w:r>
-        <w:rPr>
-          <w:b w:val="0"/>
-        </w:rPr>
-        <w:t xml:space="preserve"> transactions per shift, including refunds, exchanges and gift cards, with fully balanced cash-ups.</w:t>
+        <w:t>Processed 150+ transactions per shift, including refunds, exchanges and gift cards, with fully balanced cash-ups.</w:t>
       </w:r>
     </w:p>
     <w:p>
@@ -162,20 +136,7 @@
         <w:rPr>
           <w:b w:val="0"/>
         </w:rPr>
-        <w:t xml:space="preserve">Unpacked, tagged and priced </w:t>
-      </w:r>
-      <w:r>
-        <w:rPr>
-          <w:b w:val="0"/>
-          <w:highlight w:val="yellow"/>
-        </w:rPr>
-        <w:t>20+</w:t>
-      </w:r>
-      <w:r>
-        <w:rPr>
-          <w:b w:val="0"/>
-        </w:rPr>
-        <w:t xml:space="preserve"> cages of new stock a day, getting fresh lines onto the shop floor quickly.</w:t>
+        <w:t>Unpacked, tagged and priced 20+ cages of new stock a day, getting fresh lines onto the shop floor quickly.</w:t>
       </w:r>
     </w:p>
     <w:p>
@@ -205,7 +166,7 @@
     <w:p>
       <w:pPr>
         <w:tabs>
-          <w:tab w:pos="9751" w:val="right"/>
+          <w:tab w:pos="10091" w:val="right"/>
         </w:tabs>
         <w:spacing w:after="20" w:before="100"/>
       </w:pPr>
@@ -226,13 +187,7 @@
           <w:b w:val="0"/>
         </w:rPr>
         <w:tab/>
-      </w:r>
-      <w:r>
-        <w:rPr>
-          <w:b w:val="0"/>
-          <w:highlight w:val="yellow"/>
-        </w:rPr>
-        <w:t>Month Year – Month Year</w:t>
+        <w:t>Aug 2023 – Nov 2023</w:t>
       </w:r>
     </w:p>
     <w:p>
@@ -244,20 +199,7 @@
         <w:rPr>
           <w:b w:val="0"/>
         </w:rPr>
-        <w:t xml:space="preserve">Assisted </w:t>
-      </w:r>
-      <w:r>
-        <w:rPr>
-          <w:b w:val="0"/>
-          <w:highlight w:val="yellow"/>
-        </w:rPr>
-        <w:t>60+</w:t>
-      </w:r>
-      <w:r>
-        <w:rPr>
-          <w:b w:val="0"/>
-        </w:rPr>
-        <w:t xml:space="preserve"> customers a day on the fashion floor with styling, sizing and outfit suggestions.</w:t>
+        <w:t>Assisted 60+ customers a day on the fashion floor with styling, sizing and outfit suggestions.</w:t>
       </w:r>
     </w:p>
     <w:p>
@@ -269,20 +211,7 @@
         <w:rPr>
           <w:b w:val="0"/>
         </w:rPr>
-        <w:t xml:space="preserve">Signed up </w:t>
-      </w:r>
-      <w:r>
-        <w:rPr>
-          <w:b w:val="0"/>
-          <w:highlight w:val="yellow"/>
-        </w:rPr>
-        <w:t>40+</w:t>
-      </w:r>
-      <w:r>
-        <w:rPr>
-          <w:b w:val="0"/>
-        </w:rPr>
-        <w:t xml:space="preserve"> new ClubWest loyalty members each month by explaining the benefits at the till.</w:t>
+        <w:t>Signed up 40+ new ClubWest loyalty members each month by explaining the benefits at the till.</w:t>
       </w:r>
     </w:p>
     <w:p>
@@ -295,18 +224,6 @@
           <w:b w:val="0"/>
         </w:rPr>
         <w:t>Set up new-season displays and mannequins in line with visual merchandising guidelines.</w:t>
-      </w:r>
-    </w:p>
-    <w:p>
-      <w:pPr>
-        <w:pStyle w:val="ListBullet"/>
-        <w:spacing w:after="20"/>
-      </w:pPr>
-      <w:r>
-        <w:rPr>
-          <w:b w:val="0"/>
-        </w:rPr>
-        <w:t>Supported stock receiving, replenishment and monthly stock audits to keep counts accurate.</w:t>
       </w:r>
     </w:p>
     <w:p>
@@ -327,7 +244,58 @@
     <w:p>
       <w:pPr>
         <w:tabs>
-          <w:tab w:pos="9751" w:val="right"/>
+          <w:tab w:pos="10091" w:val="right"/>
+        </w:tabs>
+        <w:spacing w:after="20" w:before="100"/>
+      </w:pPr>
+      <w:r>
+        <w:rPr>
+          <w:b/>
+        </w:rPr>
+        <w:t>Front of House Assistant</w:t>
+      </w:r>
+      <w:r>
+        <w:rPr>
+          <w:b w:val="0"/>
+        </w:rPr>
+        <w:t xml:space="preserve"> – Chit and Chat, London</w:t>
+      </w:r>
+      <w:r>
+        <w:rPr>
+          <w:b w:val="0"/>
+        </w:rPr>
+        <w:tab/>
+        <w:t>May 2025 – Dec 2025</w:t>
+      </w:r>
+    </w:p>
+    <w:p>
+      <w:pPr>
+        <w:pStyle w:val="ListBullet"/>
+        <w:spacing w:after="20"/>
+      </w:pPr>
+      <w:r>
+        <w:rPr>
+          <w:b w:val="0"/>
+        </w:rPr>
+        <w:t>Greeted and seated guests, took orders and kept service moving smoothly during busy lunch and dinner periods.</w:t>
+      </w:r>
+    </w:p>
+    <w:p>
+      <w:pPr>
+        <w:pStyle w:val="ListBullet"/>
+        <w:spacing w:after="20"/>
+      </w:pPr>
+      <w:r>
+        <w:rPr>
+          <w:b w:val="0"/>
+        </w:rPr>
+        <w:t>Recommended sides, drinks and desserts to raise average spend, and handled payments accurately on the EPOS.</w:t>
+      </w:r>
+    </w:p>
+    <w:p>
+      <w:pPr>
+        <w:tabs>
+          <w:tab w:pos="10091" w:val="right"/>
         </w:tabs>
         <w:spacing w:after="20" w:before="100"/>
       </w:pPr>
@@ -341,27 +309,14 @@
         <w:rPr>
           <w:b w:val="0"/>
         </w:rPr>
-        <w:t xml:space="preserve"> – True Street Food, </w:t>
-      </w:r>
-      <w:r>
-        <w:rPr>
-          <w:b w:val="0"/>
-          <w:highlight w:val="yellow"/>
-        </w:rPr>
-        <w:t>City</w:t>
+        <w:t xml:space="preserve"> – True Street Food, Manchester</w:t>
       </w:r>
       <w:r>
         <w:rPr>
           <w:b w:val="0"/>
         </w:rPr>
         <w:tab/>
-      </w:r>
-      <w:r>
-        <w:rPr>
-          <w:b w:val="0"/>
-          <w:highlight w:val="yellow"/>
-        </w:rPr>
-        <w:t>Month Year – Month Year</w:t>
+        <w:t>Oct 2024 – Apr 2025</w:t>
       </w:r>
     </w:p>
     <w:p>
@@ -373,20 +328,7 @@
         <w:rPr>
           <w:b w:val="0"/>
         </w:rPr>
-        <w:t xml:space="preserve">Took orders and payments for </w:t>
-      </w:r>
-      <w:r>
-        <w:rPr>
-          <w:b w:val="0"/>
-          <w:highlight w:val="yellow"/>
-        </w:rPr>
-        <w:t>120+</w:t>
-      </w:r>
-      <w:r>
-        <w:rPr>
-          <w:b w:val="0"/>
-        </w:rPr>
-        <w:t xml:space="preserve"> customers per shift on the EPOS system during lunch and evening rushes.</w:t>
+        <w:t>Took orders and payments for 120+ customers per shift on the EPOS system during lunch and evening rushes.</w:t>
       </w:r>
     </w:p>
     <w:p>
@@ -398,25 +340,13 @@
         <w:rPr>
           <w:b w:val="0"/>
         </w:rPr>
-        <w:t>Explained the menu, specials and allergen information clearly so every customer ordered with confidence.</w:t>
-      </w:r>
-    </w:p>
-    <w:p>
-      <w:pPr>
-        <w:pStyle w:val="ListBullet"/>
-        <w:spacing w:after="20"/>
-      </w:pPr>
-      <w:r>
-        <w:rPr>
-          <w:b w:val="0"/>
-        </w:rPr>
-        <w:t>Kept the counter and seating area clean, stocked and compliant with food hygiene standards.</w:t>
+        <w:t>Explained the menu and allergen information clearly and kept the counter compliant with food hygiene standards.</w:t>
       </w:r>
     </w:p>
     <w:p>
       <w:pPr>
         <w:tabs>
-          <w:tab w:pos="9751" w:val="right"/>
+          <w:tab w:pos="10091" w:val="right"/>
         </w:tabs>
         <w:spacing w:after="20" w:before="100"/>
       </w:pPr>
@@ -430,27 +360,14 @@
         <w:rPr>
           <w:b w:val="0"/>
         </w:rPr>
-        <w:t xml:space="preserve"> – Bardez, </w:t>
-      </w:r>
-      <w:r>
-        <w:rPr>
-          <w:b w:val="0"/>
-          <w:highlight w:val="yellow"/>
-        </w:rPr>
-        <w:t>City</w:t>
+        <w:t xml:space="preserve"> – Bardez, Manchester</w:t>
       </w:r>
       <w:r>
         <w:rPr>
           <w:b w:val="0"/>
         </w:rPr>
         <w:tab/>
-      </w:r>
-      <w:r>
-        <w:rPr>
-          <w:b w:val="0"/>
-          <w:highlight w:val="yellow"/>
-        </w:rPr>
-        <w:t>Month Year – Month Year</w:t>
+        <w:t>Mar 2024 – Sep 2024</w:t>
       </w:r>
     </w:p>
     <w:p>
@@ -474,32 +391,7 @@
         <w:rPr>
           <w:b w:val="0"/>
         </w:rPr>
-        <w:t xml:space="preserve">Looked after </w:t>
-      </w:r>
-      <w:r>
-        <w:rPr>
-          <w:b w:val="0"/>
-          <w:highlight w:val="yellow"/>
-        </w:rPr>
-        <w:t>6–8</w:t>
-      </w:r>
-      <w:r>
-        <w:rPr>
-          <w:b w:val="0"/>
-        </w:rPr>
-        <w:t xml:space="preserve"> tables per shift, recommending drinks and desserts to increase spend per table.</w:t>
-      </w:r>
-    </w:p>
-    <w:p>
-      <w:pPr>
-        <w:pStyle w:val="ListBullet"/>
-        <w:spacing w:after="20"/>
-      </w:pPr>
-      <w:r>
-        <w:rPr>
-          <w:b w:val="0"/>
-        </w:rPr>
-        <w:t>Handled card and cash payments, including split bills, accurately and quickly.</w:t>
+        <w:t>Looked after 6–8 tables per shift, recommending drinks and desserts to increase spend per table.</w:t>
       </w:r>
     </w:p>
     <w:p>
@@ -520,7 +412,7 @@
     <w:p>
       <w:pPr>
         <w:tabs>
-          <w:tab w:pos="9751" w:val="right"/>
+          <w:tab w:pos="10091" w:val="right"/>
         </w:tabs>
         <w:spacing w:after="20" w:before="100"/>
       </w:pPr>
@@ -571,7 +463,7 @@
     <w:p>
       <w:pPr>
         <w:tabs>
-          <w:tab w:pos="9751" w:val="right"/>
+          <w:tab w:pos="10091" w:val="right"/>
         </w:tabs>
         <w:spacing w:after="20" w:before="100"/>
       </w:pPr>
@@ -610,7 +502,7 @@
     <w:p>
       <w:pPr>
         <w:tabs>
-          <w:tab w:pos="9751" w:val="right"/>
+          <w:tab w:pos="10091" w:val="right"/>
         </w:tabs>
         <w:spacing w:after="20" w:before="100"/>
       </w:pPr>
@@ -721,160 +613,17 @@
         <w:t>KEY SKILLS</w:t>
       </w:r>
     </w:p>
-    <w:tbl>
-      <w:tblPr>
-        <w:tblW w:type="auto" w:w="0"/>
-        <w:tblLook w:firstColumn="1" w:firstRow="1" w:lastColumn="0" w:lastRow="0" w:noHBand="0" w:noVBand="1" w:val="04A0"/>
-      </w:tblPr>
-      <w:tblGrid>
-        <w:gridCol w:w="4876"/>
-        <w:gridCol w:w="4876"/>
-      </w:tblGrid>
-      <w:tr>
-        <w:tc>
-          <w:tcPr>
-            <w:tcW w:type="dxa" w:w="4876"/>
-          </w:tcPr>
-          <w:p>
-            <w:pPr>
-              <w:pStyle w:val="ListBullet"/>
-            </w:pPr>
-            <w:r/>
-            <w:r>
-              <w:rPr>
-                <w:b w:val="0"/>
-              </w:rPr>
-              <w:t>Customer service and complaint handling</w:t>
-            </w:r>
-          </w:p>
-        </w:tc>
-        <w:tc>
-          <w:tcPr>
-            <w:tcW w:type="dxa" w:w="4876"/>
-          </w:tcPr>
-          <w:p>
-            <w:pPr>
-              <w:pStyle w:val="ListBullet"/>
-            </w:pPr>
-            <w:r/>
-            <w:r>
-              <w:rPr>
-                <w:b w:val="0"/>
-              </w:rPr>
-              <w:t>Stock control, deliveries and replenishment</w:t>
-            </w:r>
-          </w:p>
-        </w:tc>
-      </w:tr>
-      <w:tr>
-        <w:tc>
-          <w:tcPr>
-            <w:tcW w:type="dxa" w:w="4876"/>
-          </w:tcPr>
-          <w:p>
-            <w:pPr>
-              <w:pStyle w:val="ListBullet"/>
-            </w:pPr>
-            <w:r/>
-            <w:r>
-              <w:rPr>
-                <w:b w:val="0"/>
-              </w:rPr>
-              <w:t>EPOS, cash handling and card payments</w:t>
-            </w:r>
-          </w:p>
-        </w:tc>
-        <w:tc>
-          <w:tcPr>
-            <w:tcW w:type="dxa" w:w="4876"/>
-          </w:tcPr>
-          <w:p>
-            <w:pPr>
-              <w:pStyle w:val="ListBullet"/>
-            </w:pPr>
-            <w:r/>
-            <w:r>
-              <w:rPr>
-                <w:b w:val="0"/>
-              </w:rPr>
-              <w:t>Security tagging and loss prevention</w:t>
-            </w:r>
-          </w:p>
-        </w:tc>
-      </w:tr>
-      <w:tr>
-        <w:tc>
-          <w:tcPr>
-            <w:tcW w:type="dxa" w:w="4876"/>
-          </w:tcPr>
-          <w:p>
-            <w:pPr>
-              <w:pStyle w:val="ListBullet"/>
-            </w:pPr>
-            <w:r/>
-            <w:r>
-              <w:rPr>
-                <w:b w:val="0"/>
-              </w:rPr>
-              <w:t>Sales, upselling and product knowledge</w:t>
-            </w:r>
-          </w:p>
-        </w:tc>
-        <w:tc>
-          <w:tcPr>
-            <w:tcW w:type="dxa" w:w="4876"/>
-          </w:tcPr>
-          <w:p>
-            <w:pPr>
-              <w:pStyle w:val="ListBullet"/>
-            </w:pPr>
-            <w:r/>
-            <w:r>
-              <w:rPr>
-                <w:b w:val="0"/>
-              </w:rPr>
-              <w:t>Microsoft Excel, Google Sheets and Canva</w:t>
-            </w:r>
-          </w:p>
-        </w:tc>
-      </w:tr>
-      <w:tr>
-        <w:tc>
-          <w:tcPr>
-            <w:tcW w:type="dxa" w:w="4876"/>
-          </w:tcPr>
-          <w:p>
-            <w:pPr>
-              <w:pStyle w:val="ListBullet"/>
-            </w:pPr>
-            <w:r/>
-            <w:r>
-              <w:rPr>
-                <w:b w:val="0"/>
-              </w:rPr>
-              <w:t>Visual merchandising and shop-floor standards</w:t>
-            </w:r>
-          </w:p>
-        </w:tc>
-        <w:tc>
-          <w:tcPr>
-            <w:tcW w:type="dxa" w:w="4876"/>
-          </w:tcPr>
-          <w:p>
-            <w:pPr>
-              <w:pStyle w:val="ListBullet"/>
-            </w:pPr>
-            <w:r/>
-            <w:r>
-              <w:rPr>
-                <w:b w:val="0"/>
-              </w:rPr>
-              <w:t>Teamwork and working under pressure</w:t>
-            </w:r>
-          </w:p>
-        </w:tc>
-      </w:tr>
-    </w:tbl>
+    <w:p>
+      <w:pPr>
+        <w:spacing w:after="0" w:before="0"/>
+      </w:pPr>
+      <w:r>
+        <w:rPr>
+          <w:b w:val="0"/>
+        </w:rPr>
+        <w:t>Customer service and complaint handling  •  EPOS, cash handling and card payments  •  Sales, upselling and product knowledge  •  Visual merchandising and shop-floor standards  •  Stock control, deliveries and replenishment  •  Security tagging and loss prevention  •  Microsoft Excel, Google Sheets and Canva  •  Teamwork and working under pressure</w:t>
+      </w:r>
+    </w:p>
     <w:p>
       <w:pPr>
         <w:spacing w:after="0" w:before="100"/>
@@ -888,7 +637,7 @@
     </w:p>
     <w:sectPr>
       <w:pgSz w:w="11906" w:h="16838"/>
-      <w:pgMar w:top="737" w:right="1077" w:bottom="737" w:left="1077" w:header="720" w:footer="720" w:gutter="0"/>
+      <w:pgMar w:top="680" w:right="907" w:bottom="680" w:left="907" w:header="720" w:footer="720" w:gutter="0"/>
       <w:cols w:space="720"/>
       <w:docGrid w:linePitch="360"/>
     </w:sectPr>
@@ -1260,7 +1009,7 @@
     <w:qFormat/>
     <w:rsid w:val="00FC693F"/>
     <w:pPr>
-      <w:spacing w:after="0" w:line="252" w:lineRule="auto"/>
+      <w:spacing w:after="0" w:line="240" w:lineRule="auto"/>
     </w:pPr>
     <w:rPr>
       <w:rFonts w:ascii="Arial" w:hAnsi="Arial" w:eastAsia="Arial"/>

</xml_diff>

<commit_message>
Retail CV: remove TK Maxx, keep two front-of-house roles
Co-Authored-By: Claude Opus 5.5 <noreply@anthropic.com>
Claude-Session: https://claude.ai/code/session_01MNmMoUTURwQqNjm7K6SsYQ
</commit_message>
<xml_diff>
--- a/cv/Jithin_George_Retail_CV.docx
+++ b/cv/Jithin_George_Retail_CV.docx
@@ -70,7 +70,7 @@
         <w:rPr>
           <w:b w:val="0"/>
         </w:rPr>
-        <w:t>Customer-focused retail and front of house professional with experience in fashion retail in India and the UK, including TK Maxx, alongside busy hospitality roles in the UK. Confident on the till, on the shop floor and in the stockroom, with a sharp eye for display standards. Backed by three years in client-facing marketing and an MSc in Digital Marketing focused on consumer behaviour.</w:t>
+        <w:t>Customer-focused retail and front of house professional with fashion retail experience in India and busy hospitality roles in the UK. Confident on the till, on the shop floor and with stock, with a sharp eye for display standards and a friendly, professional manner under pressure. Backed by three years in client-facing marketing and an MSc in Digital Marketing focused on consumer behaviour, so understands what makes shoppers buy.</w:t>
       </w:r>
     </w:p>
     <w:p>
@@ -85,7 +85,7 @@
           <w:b/>
           <w:sz w:val="23"/>
         </w:rPr>
-        <w:t>RETAIL EXPERIENCE</w:t>
+        <w:t>RETAIL &amp; CUSTOMER SERVICE EXPERIENCE</w:t>
       </w:r>
     </w:p>
     <w:p>
@@ -99,20 +99,20 @@
         <w:rPr>
           <w:b/>
         </w:rPr>
-        <w:t>Sales Assistant</w:t>
+        <w:t>Front of House Team Member</w:t>
       </w:r>
       <w:r>
         <w:rPr>
           <w:b w:val="0"/>
         </w:rPr>
-        <w:t xml:space="preserve"> – TK Maxx, Wembley, London</w:t>
+        <w:t xml:space="preserve"> – True Street Food, Manchester</w:t>
       </w:r>
       <w:r>
         <w:rPr>
           <w:b w:val="0"/>
         </w:rPr>
         <w:tab/>
-        <w:t>Jan 2026 – Sep 2026</w:t>
+        <w:t>Oct 2024 – Apr 2025</w:t>
       </w:r>
     </w:p>
     <w:p>
@@ -124,7 +124,7 @@
         <w:rPr>
           <w:b w:val="0"/>
         </w:rPr>
-        <w:t>Processed 150+ transactions per shift, including refunds, exchanges and gift cards, with fully balanced cash-ups.</w:t>
+        <w:t>Took orders and payments for 120+ customers per shift on the EPOS system during lunch and evening rushes.</w:t>
       </w:r>
     </w:p>
     <w:p>
@@ -136,7 +136,7 @@
         <w:rPr>
           <w:b w:val="0"/>
         </w:rPr>
-        <w:t>Unpacked, tagged and priced 20+ cages of new stock a day, getting fresh lines onto the shop floor quickly.</w:t>
+        <w:t>Recommended sides and drinks to customers, helping to lift average spend per order.</w:t>
       </w:r>
     </w:p>
     <w:p>
@@ -148,7 +148,34 @@
         <w:rPr>
           <w:b w:val="0"/>
         </w:rPr>
-        <w:t>Kept departments and fitting rooms sized, tidy and recovered to brand standard throughout trading hours.</w:t>
+        <w:t>Explained the menu and allergen information clearly and kept the counter compliant with food hygiene standards.</w:t>
+      </w:r>
+    </w:p>
+    <w:p>
+      <w:pPr>
+        <w:tabs>
+          <w:tab w:pos="10091" w:val="right"/>
+        </w:tabs>
+        <w:spacing w:after="20" w:before="100"/>
+      </w:pPr>
+      <w:r>
+        <w:rPr>
+          <w:b/>
+        </w:rPr>
+        <w:t>Front of House Staff</w:t>
+      </w:r>
+      <w:r>
+        <w:rPr>
+          <w:b w:val="0"/>
+        </w:rPr>
+        <w:t xml:space="preserve"> – Bardez, Manchester</w:t>
+      </w:r>
+      <w:r>
+        <w:rPr>
+          <w:b w:val="0"/>
+        </w:rPr>
+        <w:tab/>
+        <w:t>Mar 2024 – Sep 2024</w:t>
       </w:r>
     </w:p>
     <w:p>
@@ -160,7 +187,31 @@
         <w:rPr>
           <w:b w:val="0"/>
         </w:rPr>
-        <w:t>Helped customers find sizes, brands and bargains, turning browsers into buyers with honest product advice.</w:t>
+        <w:t>Welcomed guests, managed walk-ins and reservations, and kept table turnover smooth on busy nights.</w:t>
+      </w:r>
+    </w:p>
+    <w:p>
+      <w:pPr>
+        <w:pStyle w:val="ListBullet"/>
+        <w:spacing w:after="20"/>
+      </w:pPr>
+      <w:r>
+        <w:rPr>
+          <w:b w:val="0"/>
+        </w:rPr>
+        <w:t>Looked after 6–8 tables per shift, recommending drinks and desserts to increase spend per table.</w:t>
+      </w:r>
+    </w:p>
+    <w:p>
+      <w:pPr>
+        <w:pStyle w:val="ListBullet"/>
+        <w:spacing w:after="20"/>
+      </w:pPr>
+      <w:r>
+        <w:rPr>
+          <w:b w:val="0"/>
+        </w:rPr>
+        <w:t>Handled card and cash payments, including split bills, accurately and quickly.</w:t>
       </w:r>
     </w:p>
     <w:p>
@@ -228,48 +279,6 @@
     </w:p>
     <w:p>
       <w:pPr>
-        <w:spacing w:after="60" w:before="160"/>
-        <w:pBdr>
-          <w:bottom w:val="single" w:sz="6" w:space="2" w:color="333333"/>
-        </w:pBdr>
-      </w:pPr>
-      <w:r>
-        <w:rPr>
-          <w:b/>
-          <w:sz w:val="23"/>
-        </w:rPr>
-        <w:t>FRONT OF HOUSE EXPERIENCE</w:t>
-      </w:r>
-    </w:p>
-    <w:p>
-      <w:pPr>
-        <w:tabs>
-          <w:tab w:pos="10091" w:val="right"/>
-        </w:tabs>
-        <w:spacing w:after="20" w:before="100"/>
-      </w:pPr>
-      <w:r>
-        <w:rPr>
-          <w:b/>
-        </w:rPr>
-        <w:t>Front of House Assistant</w:t>
-      </w:r>
-      <w:r>
-        <w:rPr>
-          <w:b w:val="0"/>
-        </w:rPr>
-        <w:t xml:space="preserve"> – Chit and Chat, London</w:t>
-      </w:r>
-      <w:r>
-        <w:rPr>
-          <w:b w:val="0"/>
-        </w:rPr>
-        <w:tab/>
-        <w:t>May 2025 – Dec 2025</w:t>
-      </w:r>
-    </w:p>
-    <w:p>
-      <w:pPr>
         <w:pStyle w:val="ListBullet"/>
         <w:spacing w:after="20"/>
       </w:pPr>
@@ -277,121 +286,7 @@
         <w:rPr>
           <w:b w:val="0"/>
         </w:rPr>
-        <w:t>Greeted and seated guests, took orders and kept service moving smoothly during busy lunch and dinner periods.</w:t>
-      </w:r>
-    </w:p>
-    <w:p>
-      <w:pPr>
-        <w:pStyle w:val="ListBullet"/>
-        <w:spacing w:after="20"/>
-      </w:pPr>
-      <w:r>
-        <w:rPr>
-          <w:b w:val="0"/>
-        </w:rPr>
-        <w:t>Recommended sides, drinks and desserts to raise average spend, and handled payments accurately on the EPOS.</w:t>
-      </w:r>
-    </w:p>
-    <w:p>
-      <w:pPr>
-        <w:tabs>
-          <w:tab w:pos="10091" w:val="right"/>
-        </w:tabs>
-        <w:spacing w:after="20" w:before="100"/>
-      </w:pPr>
-      <w:r>
-        <w:rPr>
-          <w:b/>
-        </w:rPr>
-        <w:t>Front of House Team Member</w:t>
-      </w:r>
-      <w:r>
-        <w:rPr>
-          <w:b w:val="0"/>
-        </w:rPr>
-        <w:t xml:space="preserve"> – True Street Food, Manchester</w:t>
-      </w:r>
-      <w:r>
-        <w:rPr>
-          <w:b w:val="0"/>
-        </w:rPr>
-        <w:tab/>
-        <w:t>Oct 2024 – Apr 2025</w:t>
-      </w:r>
-    </w:p>
-    <w:p>
-      <w:pPr>
-        <w:pStyle w:val="ListBullet"/>
-        <w:spacing w:after="20"/>
-      </w:pPr>
-      <w:r>
-        <w:rPr>
-          <w:b w:val="0"/>
-        </w:rPr>
-        <w:t>Took orders and payments for 120+ customers per shift on the EPOS system during lunch and evening rushes.</w:t>
-      </w:r>
-    </w:p>
-    <w:p>
-      <w:pPr>
-        <w:pStyle w:val="ListBullet"/>
-        <w:spacing w:after="20"/>
-      </w:pPr>
-      <w:r>
-        <w:rPr>
-          <w:b w:val="0"/>
-        </w:rPr>
-        <w:t>Explained the menu and allergen information clearly and kept the counter compliant with food hygiene standards.</w:t>
-      </w:r>
-    </w:p>
-    <w:p>
-      <w:pPr>
-        <w:tabs>
-          <w:tab w:pos="10091" w:val="right"/>
-        </w:tabs>
-        <w:spacing w:after="20" w:before="100"/>
-      </w:pPr>
-      <w:r>
-        <w:rPr>
-          <w:b/>
-        </w:rPr>
-        <w:t>Front of House Staff</w:t>
-      </w:r>
-      <w:r>
-        <w:rPr>
-          <w:b w:val="0"/>
-        </w:rPr>
-        <w:t xml:space="preserve"> – Bardez, Manchester</w:t>
-      </w:r>
-      <w:r>
-        <w:rPr>
-          <w:b w:val="0"/>
-        </w:rPr>
-        <w:tab/>
-        <w:t>Mar 2024 – Sep 2024</w:t>
-      </w:r>
-    </w:p>
-    <w:p>
-      <w:pPr>
-        <w:pStyle w:val="ListBullet"/>
-        <w:spacing w:after="20"/>
-      </w:pPr>
-      <w:r>
-        <w:rPr>
-          <w:b w:val="0"/>
-        </w:rPr>
-        <w:t>Welcomed guests, managed walk-ins and reservations, and kept table turnover smooth on busy nights.</w:t>
-      </w:r>
-    </w:p>
-    <w:p>
-      <w:pPr>
-        <w:pStyle w:val="ListBullet"/>
-        <w:spacing w:after="20"/>
-      </w:pPr>
-      <w:r>
-        <w:rPr>
-          <w:b w:val="0"/>
-        </w:rPr>
-        <w:t>Looked after 6–8 tables per shift, recommending drinks and desserts to increase spend per table.</w:t>
+        <w:t>Supported stock receiving, replenishment and monthly stock audits to keep counts accurate.</w:t>
       </w:r>
     </w:p>
     <w:p>
@@ -621,7 +516,7 @@
         <w:rPr>
           <w:b w:val="0"/>
         </w:rPr>
-        <w:t>Customer service and complaint handling  •  EPOS, cash handling and card payments  •  Sales, upselling and product knowledge  •  Visual merchandising and shop-floor standards  •  Stock control, deliveries and replenishment  •  Security tagging and loss prevention  •  Microsoft Excel, Google Sheets and Canva  •  Teamwork and working under pressure</w:t>
+        <w:t>Customer service and complaint handling  •  EPOS, cash handling and card payments  •  Sales, upselling and product knowledge  •  Visual merchandising and shop-floor standards  •  Stock control, deliveries and replenishment  •  Microsoft Excel, Google Sheets and Canva  •  Teamwork and working under pressure</w:t>
       </w:r>
     </w:p>
     <w:p>

</xml_diff>

<commit_message>
Retail CV: add Wembley sales assistant role with shop-name placeholder
Co-Authored-By: Claude Opus 5.5 <noreply@anthropic.com>
Claude-Session: https://claude.ai/code/session_01MNmMoUTURwQqNjm7K6SsYQ
</commit_message>
<xml_diff>
--- a/cv/Jithin_George_Retail_CV.docx
+++ b/cv/Jithin_George_Retail_CV.docx
@@ -70,7 +70,7 @@
         <w:rPr>
           <w:b w:val="0"/>
         </w:rPr>
-        <w:t>Customer-focused retail and front of house professional with fashion retail experience in India and busy hospitality roles in the UK. Confident on the till, on the shop floor and with stock, with a sharp eye for display standards and a friendly, professional manner under pressure. Backed by three years in client-facing marketing and an MSc in Digital Marketing focused on consumer behaviour, so understands what makes shoppers buy.</w:t>
+        <w:t>Customer-focused retail and front of house professional with retail experience in the UK and India and busy hospitality roles in the UK. Confident on the till, on the shop floor and with stock, with a sharp eye for display standards and a friendly, professional manner under pressure. Backed by three years in client-facing marketing and an MSc in Digital Marketing focused on consumer behaviour, so understands what makes shoppers buy.</w:t>
       </w:r>
     </w:p>
     <w:p>
@@ -86,6 +86,82 @@
           <w:sz w:val="23"/>
         </w:rPr>
         <w:t>RETAIL &amp; CUSTOMER SERVICE EXPERIENCE</w:t>
+      </w:r>
+    </w:p>
+    <w:p>
+      <w:pPr>
+        <w:tabs>
+          <w:tab w:pos="10091" w:val="right"/>
+        </w:tabs>
+        <w:spacing w:after="20" w:before="100"/>
+      </w:pPr>
+      <w:r>
+        <w:rPr>
+          <w:b/>
+        </w:rPr>
+        <w:t>Sales Assistant</w:t>
+      </w:r>
+      <w:r>
+        <w:rPr>
+          <w:b w:val="0"/>
+        </w:rPr>
+        <w:t xml:space="preserve"> – </w:t>
+      </w:r>
+      <w:r>
+        <w:rPr>
+          <w:b w:val="0"/>
+          <w:highlight w:val="yellow"/>
+        </w:rPr>
+        <w:t>Shop name</w:t>
+      </w:r>
+      <w:r>
+        <w:rPr>
+          <w:b w:val="0"/>
+        </w:rPr>
+        <w:t>, Wembley, London</w:t>
+      </w:r>
+      <w:r>
+        <w:rPr>
+          <w:b w:val="0"/>
+        </w:rPr>
+        <w:tab/>
+        <w:t>Jan 2026 – Sep 2026</w:t>
+      </w:r>
+    </w:p>
+    <w:p>
+      <w:pPr>
+        <w:pStyle w:val="ListBullet"/>
+        <w:spacing w:after="20"/>
+      </w:pPr>
+      <w:r>
+        <w:rPr>
+          <w:b w:val="0"/>
+        </w:rPr>
+        <w:t>Served customers on the till, handling cash, card, refunds and exchanges with balanced end-of-shift cash-ups.</w:t>
+      </w:r>
+    </w:p>
+    <w:p>
+      <w:pPr>
+        <w:pStyle w:val="ListBullet"/>
+        <w:spacing w:after="20"/>
+      </w:pPr>
+      <w:r>
+        <w:rPr>
+          <w:b w:val="0"/>
+        </w:rPr>
+        <w:t>Received deliveries, priced and replenished stock, and kept shelves full, faced up and easy to shop.</w:t>
+      </w:r>
+    </w:p>
+    <w:p>
+      <w:pPr>
+        <w:pStyle w:val="ListBullet"/>
+        <w:spacing w:after="20"/>
+      </w:pPr>
+      <w:r>
+        <w:rPr>
+          <w:b w:val="0"/>
+        </w:rPr>
+        <w:t>Helped customers find products and answered queries, recommending alternatives when items were out of stock.</w:t>
       </w:r>
     </w:p>
     <w:p>

</xml_diff>

<commit_message>
Retail CV: add Vans Outlet, Wembley as current retail role
Co-Authored-By: Claude Opus 5.5 <noreply@anthropic.com>
Claude-Session: https://claude.ai/code/session_01MNmMoUTURwQqNjm7K6SsYQ
</commit_message>
<xml_diff>
--- a/cv/Jithin_George_Retail_CV.docx
+++ b/cv/Jithin_George_Retail_CV.docx
@@ -105,20 +105,7 @@
         <w:rPr>
           <w:b w:val="0"/>
         </w:rPr>
-        <w:t xml:space="preserve"> – </w:t>
-      </w:r>
-      <w:r>
-        <w:rPr>
-          <w:b w:val="0"/>
-          <w:highlight w:val="yellow"/>
-        </w:rPr>
-        <w:t>Shop name</w:t>
-      </w:r>
-      <w:r>
-        <w:rPr>
-          <w:b w:val="0"/>
-        </w:rPr>
-        <w:t>, Wembley, London</w:t>
+        <w:t xml:space="preserve"> – Vans Outlet, London Designer Outlet, Wembley</w:t>
       </w:r>
       <w:r>
         <w:rPr>
@@ -161,7 +148,7 @@
         <w:rPr>
           <w:b w:val="0"/>
         </w:rPr>
-        <w:t>Helped customers find products and answered queries, recommending alternatives when items were out of stock.</w:t>
+        <w:t>Helped customers find the right fit and style across footwear and clothing, suggesting alternatives when sizes were out of stock.</w:t>
       </w:r>
     </w:p>
     <w:p>

</xml_diff>

<commit_message>
Retail CV: single-line bullets, expand marketing roles, two-column skills
Co-Authored-By: Claude Opus 5.5 <noreply@anthropic.com>
Claude-Session: https://claude.ai/code/session_01MNmMoUTURwQqNjm7K6SsYQ
</commit_message>
<xml_diff>
--- a/cv/Jithin_George_Retail_CV.docx
+++ b/cv/Jithin_George_Retail_CV.docx
@@ -124,7 +124,7 @@
         <w:rPr>
           <w:b w:val="0"/>
         </w:rPr>
-        <w:t>Served customers on the till, handling cash, card, refunds and exchanges with balanced end-of-shift cash-ups.</w:t>
+        <w:t>Served customers on the till, handling cash, card, refunds and exchanges with balanced cash-ups.</w:t>
       </w:r>
     </w:p>
     <w:p>
@@ -148,7 +148,7 @@
         <w:rPr>
           <w:b w:val="0"/>
         </w:rPr>
-        <w:t>Helped customers find the right fit and style across footwear and clothing, suggesting alternatives when sizes were out of stock.</w:t>
+        <w:t>Helped customers find the right fit and style across footwear and clothing.</w:t>
       </w:r>
     </w:p>
     <w:p>
@@ -187,7 +187,7 @@
         <w:rPr>
           <w:b w:val="0"/>
         </w:rPr>
-        <w:t>Took orders and payments for 120+ customers per shift on the EPOS system during lunch and evening rushes.</w:t>
+        <w:t>Took orders and payments for 120+ customers per shift on EPOS during lunch and evening rushes.</w:t>
       </w:r>
     </w:p>
     <w:p>
@@ -211,7 +211,7 @@
         <w:rPr>
           <w:b w:val="0"/>
         </w:rPr>
-        <w:t>Explained the menu and allergen information clearly and kept the counter compliant with food hygiene standards.</w:t>
+        <w:t>Explained menu and allergen information clearly and followed food hygiene standards.</w:t>
       </w:r>
     </w:p>
     <w:p>
@@ -420,6 +420,30 @@
     </w:p>
     <w:p>
       <w:pPr>
+        <w:pStyle w:val="ListBullet"/>
+        <w:spacing w:after="20"/>
+      </w:pPr>
+      <w:r>
+        <w:rPr>
+          <w:b w:val="0"/>
+        </w:rPr>
+        <w:t>Delivered 4 end-to-end campaigns, keeping clients updated from first brief to final delivery.</w:t>
+      </w:r>
+    </w:p>
+    <w:p>
+      <w:pPr>
+        <w:pStyle w:val="ListBullet"/>
+        <w:spacing w:after="20"/>
+      </w:pPr>
+      <w:r>
+        <w:rPr>
+          <w:b w:val="0"/>
+        </w:rPr>
+        <w:t>Track KPIs and deliverables in Excel and Trello, and build client presentations in Canva.</w:t>
+      </w:r>
+    </w:p>
+    <w:p>
+      <w:pPr>
         <w:tabs>
           <w:tab w:pos="10091" w:val="right"/>
         </w:tabs>
@@ -454,7 +478,31 @@
         <w:rPr>
           <w:b w:val="0"/>
         </w:rPr>
-        <w:t>Onboarded 10+ creators per campaign and built a database of 500+ creators for faster brand matching.</w:t>
+        <w:t>Onboarded 10+ creators per campaign, managing contracts, timelines and deliverables.</w:t>
+      </w:r>
+    </w:p>
+    <w:p>
+      <w:pPr>
+        <w:pStyle w:val="ListBullet"/>
+        <w:spacing w:after="20"/>
+      </w:pPr>
+      <w:r>
+        <w:rPr>
+          <w:b w:val="0"/>
+        </w:rPr>
+        <w:t>Built and maintained a database of 500+ creators for faster brand–creator matching.</w:t>
+      </w:r>
+    </w:p>
+    <w:p>
+      <w:pPr>
+        <w:pStyle w:val="ListBullet"/>
+        <w:spacing w:after="20"/>
+      </w:pPr>
+      <w:r>
+        <w:rPr>
+          <w:b w:val="0"/>
+        </w:rPr>
+        <w:t>Analysed reach and engagement across 60+ posts to pick top performers for repeat campaigns.</w:t>
       </w:r>
     </w:p>
     <w:p>
@@ -493,7 +541,31 @@
         <w:rPr>
           <w:b w:val="0"/>
         </w:rPr>
-        <w:t>Ran online auditions for 250+ participants and set up an Excel tracker that cut turnaround time by 40%.</w:t>
+        <w:t>Sourced 300+ applicants through Facebook, Instagram and YouTube, tracking each one in Excel.</w:t>
+      </w:r>
+    </w:p>
+    <w:p>
+      <w:pPr>
+        <w:pStyle w:val="ListBullet"/>
+        <w:spacing w:after="20"/>
+      </w:pPr>
+      <w:r>
+        <w:rPr>
+          <w:b w:val="0"/>
+        </w:rPr>
+        <w:t>Ran online auditions for 250+ participants, recording scores, feedback and shortlisting decisions.</w:t>
+      </w:r>
+    </w:p>
+    <w:p>
+      <w:pPr>
+        <w:pStyle w:val="ListBullet"/>
+        <w:spacing w:after="20"/>
+      </w:pPr>
+      <w:r>
+        <w:rPr>
+          <w:b w:val="0"/>
+        </w:rPr>
+        <w:t>Set up a central Excel tracker that cut audition turnaround time by 40%.</w:t>
       </w:r>
     </w:p>
     <w:p>
@@ -571,17 +643,152 @@
         <w:t>KEY SKILLS</w:t>
       </w:r>
     </w:p>
-    <w:p>
-      <w:pPr>
-        <w:spacing w:after="0" w:before="0"/>
-      </w:pPr>
-      <w:r>
-        <w:rPr>
-          <w:b w:val="0"/>
-        </w:rPr>
-        <w:t>Customer service and complaint handling  •  EPOS, cash handling and card payments  •  Sales, upselling and product knowledge  •  Visual merchandising and shop-floor standards  •  Stock control, deliveries and replenishment  •  Microsoft Excel, Google Sheets and Canva  •  Teamwork and working under pressure</w:t>
-      </w:r>
-    </w:p>
+    <w:tbl>
+      <w:tblPr>
+        <w:tblW w:type="auto" w:w="0"/>
+        <w:tblLook w:firstColumn="1" w:firstRow="1" w:lastColumn="0" w:lastRow="0" w:noHBand="0" w:noVBand="1" w:val="04A0"/>
+      </w:tblPr>
+      <w:tblGrid>
+        <w:gridCol w:w="5046"/>
+        <w:gridCol w:w="5046"/>
+      </w:tblGrid>
+      <w:tr>
+        <w:tc>
+          <w:tcPr>
+            <w:tcW w:type="dxa" w:w="5046"/>
+          </w:tcPr>
+          <w:p>
+            <w:pPr>
+              <w:pStyle w:val="ListBullet"/>
+            </w:pPr>
+            <w:r>
+              <w:rPr>
+                <w:b w:val="0"/>
+              </w:rPr>
+              <w:t>Customer service and complaint handling</w:t>
+            </w:r>
+          </w:p>
+        </w:tc>
+        <w:tc>
+          <w:tcPr>
+            <w:tcW w:type="dxa" w:w="5046"/>
+          </w:tcPr>
+          <w:p>
+            <w:pPr>
+              <w:pStyle w:val="ListBullet"/>
+            </w:pPr>
+            <w:r>
+              <w:rPr>
+                <w:b w:val="0"/>
+              </w:rPr>
+              <w:t>Stock control, deliveries and replenishment</w:t>
+            </w:r>
+          </w:p>
+        </w:tc>
+      </w:tr>
+      <w:tr>
+        <w:tc>
+          <w:tcPr>
+            <w:tcW w:type="dxa" w:w="5046"/>
+          </w:tcPr>
+          <w:p>
+            <w:pPr>
+              <w:pStyle w:val="ListBullet"/>
+            </w:pPr>
+            <w:r>
+              <w:rPr>
+                <w:b w:val="0"/>
+              </w:rPr>
+              <w:t>EPOS, cash handling and card payments</w:t>
+            </w:r>
+          </w:p>
+        </w:tc>
+        <w:tc>
+          <w:tcPr>
+            <w:tcW w:type="dxa" w:w="5046"/>
+          </w:tcPr>
+          <w:p>
+            <w:pPr>
+              <w:pStyle w:val="ListBullet"/>
+            </w:pPr>
+            <w:r>
+              <w:rPr>
+                <w:b w:val="0"/>
+              </w:rPr>
+              <w:t>Opening, closing and cash-up procedures</w:t>
+            </w:r>
+          </w:p>
+        </w:tc>
+      </w:tr>
+      <w:tr>
+        <w:tc>
+          <w:tcPr>
+            <w:tcW w:type="dxa" w:w="5046"/>
+          </w:tcPr>
+          <w:p>
+            <w:pPr>
+              <w:pStyle w:val="ListBullet"/>
+            </w:pPr>
+            <w:r>
+              <w:rPr>
+                <w:b w:val="0"/>
+              </w:rPr>
+              <w:t>Sales, upselling and product knowledge</w:t>
+            </w:r>
+          </w:p>
+        </w:tc>
+        <w:tc>
+          <w:tcPr>
+            <w:tcW w:type="dxa" w:w="5046"/>
+          </w:tcPr>
+          <w:p>
+            <w:pPr>
+              <w:pStyle w:val="ListBullet"/>
+            </w:pPr>
+            <w:r>
+              <w:rPr>
+                <w:b w:val="0"/>
+              </w:rPr>
+              <w:t>Microsoft Excel, Google Sheets and Canva</w:t>
+            </w:r>
+          </w:p>
+        </w:tc>
+      </w:tr>
+      <w:tr>
+        <w:tc>
+          <w:tcPr>
+            <w:tcW w:type="dxa" w:w="5046"/>
+          </w:tcPr>
+          <w:p>
+            <w:pPr>
+              <w:pStyle w:val="ListBullet"/>
+            </w:pPr>
+            <w:r>
+              <w:rPr>
+                <w:b w:val="0"/>
+              </w:rPr>
+              <w:t>Visual merchandising and shop-floor standards</w:t>
+            </w:r>
+          </w:p>
+        </w:tc>
+        <w:tc>
+          <w:tcPr>
+            <w:tcW w:type="dxa" w:w="5046"/>
+          </w:tcPr>
+          <w:p>
+            <w:pPr>
+              <w:pStyle w:val="ListBullet"/>
+            </w:pPr>
+            <w:r>
+              <w:rPr>
+                <w:b w:val="0"/>
+              </w:rPr>
+              <w:t>Teamwork and working under pressure</w:t>
+            </w:r>
+          </w:p>
+        </w:tc>
+      </w:tr>
+    </w:tbl>
     <w:p>
       <w:pPr>
         <w:spacing w:after="0" w:before="100"/>

</xml_diff>

<commit_message>
Retail CV: make email and LinkedIn clickable
Co-Authored-By: Claude Opus 5.5 <noreply@anthropic.com>
Claude-Session: https://claude.ai/code/session_01MNmMoUTURwQqNjm7K6SsYQ
</commit_message>
<xml_diff>
--- a/cv/Jithin_George_Retail_CV.docx
+++ b/cv/Jithin_George_Retail_CV.docx
@@ -33,8 +33,24 @@
         <w:rPr>
           <w:b w:val="0"/>
         </w:rPr>
-        <w:t>+44 7721 960626  |  jithindavid.19@gmail.com  |  linkedin.com/in/jithin-george-jj1999</w:t>
+        <w:t xml:space="preserve">+44 7721 960626  |  </w:t>
       </w:r>
+      <w:hyperlink r:id="rId9">
+        <w:r>
+          <w:t>jithindavid.19@gmail.com</w:t>
+        </w:r>
+      </w:hyperlink>
+      <w:r>
+        <w:rPr>
+          <w:b w:val="0"/>
+        </w:rPr>
+        <w:t xml:space="preserve">  |  </w:t>
+      </w:r>
+      <w:hyperlink r:id="rId10">
+        <w:r>
+          <w:t>linkedin.com/in/jithin-george-jj1999</w:t>
+        </w:r>
+      </w:hyperlink>
     </w:p>
     <w:p>
       <w:pPr>

</xml_diff>

<commit_message>
Retail CV: remove references line
Co-Authored-By: Claude Opus 5.5 <noreply@anthropic.com>
Claude-Session: https://claude.ai/code/session_01MNmMoUTURwQqNjm7K6SsYQ
</commit_message>
<xml_diff>
--- a/cv/Jithin_George_Retail_CV.docx
+++ b/cv/Jithin_George_Retail_CV.docx
@@ -805,17 +805,6 @@
         </w:tc>
       </w:tr>
     </w:tbl>
-    <w:p>
-      <w:pPr>
-        <w:spacing w:after="0" w:before="100"/>
-      </w:pPr>
-      <w:r>
-        <w:rPr>
-          <w:b w:val="0"/>
-        </w:rPr>
-        <w:t>References available on request.</w:t>
-      </w:r>
-    </w:p>
     <w:sectPr>
       <w:pgSz w:w="11906" w:h="16838"/>
       <w:pgMar w:top="680" w:right="907" w:bottom="680" w:left="907" w:header="720" w:footer="720" w:gutter="0"/>

</xml_diff>

<commit_message>
Retail CV: add figures to Vans role
Co-Authored-By: Claude Opus 5.5 <noreply@anthropic.com>
Claude-Session: https://claude.ai/code/session_01MNmMoUTURwQqNjm7K6SsYQ
</commit_message>
<xml_diff>
--- a/cv/Jithin_George_Retail_CV.docx
+++ b/cv/Jithin_George_Retail_CV.docx
@@ -140,7 +140,7 @@
         <w:rPr>
           <w:b w:val="0"/>
         </w:rPr>
-        <w:t>Served customers on the till, handling cash, card, refunds and exchanges with balanced cash-ups.</w:t>
+        <w:t>Processed 100+ till transactions per shift, including refunds and exchanges, with balanced cash-ups.</w:t>
       </w:r>
     </w:p>
     <w:p>
@@ -152,7 +152,7 @@
         <w:rPr>
           <w:b w:val="0"/>
         </w:rPr>
-        <w:t>Received deliveries, priced and replenished stock, and kept shelves full, faced up and easy to shop.</w:t>
+        <w:t>Unpacked, tagged and replenished 300+ units of stock a week, keeping the shop floor full and tidy.</w:t>
       </w:r>
     </w:p>
     <w:p>
@@ -164,7 +164,7 @@
         <w:rPr>
           <w:b w:val="0"/>
         </w:rPr>
-        <w:t>Helped customers find the right fit and style across footwear and clothing.</w:t>
+        <w:t>Helped 50+ customers a day find the right fit and style across footwear and clothing.</w:t>
       </w:r>
     </w:p>
     <w:p>

</xml_diff>